<commit_message>
docs: publish DDS-8555 assignment 7 deliverables
</commit_message>
<xml_diff>
--- a/Week 7/Assignment 7/MaldonadoJDDS8555-7.docx
+++ b/Week 7/Assignment 7/MaldonadoJDDS8555-7.docx
@@ -86,7 +86,7 @@
           <w:b w:val="0"/>
           <w:i w:val="0"/>
         </w:rPr>
-        <w:t>June 07, 2026</w:t>
+        <w:t>June 11, 2026</w:t>
       </w:r>
     </w:p>
     <w:p>
@@ -136,7 +136,7 @@
           <w:b w:val="0"/>
           <w:i w:val="0"/>
         </w:rPr>
-        <w:t>This assignment used PCA and clustering to find structure without a labeled outcome.  The conceptual K-means question showed why the algorithm reduces the within-cluster objective at each step.  The USArrests exercise showed that scaling materially changes hierarchical clustering because distance is unit-sensitive, which is the same reason the Wine chemistry variables were standardized before PCA and clustering.</w:t>
+        <w:t>This assignment used PCA and clustering to find structure without a labeled outcome.  The conceptual question now proves the pairwise-distance identity behind the K-means objective and explains why the assignment and centroid-update steps cannot increase the objective.  In the USArrests exercise, complete-linkage clustering was run before and after scaling, and the full state membership lists show that scaling materially changes the clustering because Euclidean distance is unit-sensitive.</w:t>
       </w:r>
     </w:p>
     <w:p>
@@ -149,7 +149,7 @@
           <w:b/>
           <w:i w:val="0"/>
         </w:rPr>
-        <w:t>PCA</w:t>
+        <w:t>PCA and K-Means</w:t>
       </w:r>
     </w:p>
     <w:p>
@@ -162,33 +162,7 @@
           <w:b w:val="0"/>
           <w:i w:val="0"/>
         </w:rPr>
-        <w:t>For the Wine data, PCA reduced correlated chemical variables into enough components to preserve at least 80% of the variance.  The loading table keeps the result interpretable by showing how the original chemistry measurements contribute to the retained components.  Without that table, the dimensionality reduction would be mathematically valid but substantively thin (Jolliffe, 2002).</w:t>
-      </w:r>
-    </w:p>
-    <w:p>
-      <w:pPr>
-        <w:spacing w:line="480" w:lineRule="auto"/>
-        <w:jc w:val="center"/>
-      </w:pPr>
-      <w:r>
-        <w:rPr>
-          <w:b/>
-          <w:i w:val="0"/>
-        </w:rPr>
-        <w:t>K-Means</w:t>
-      </w:r>
-    </w:p>
-    <w:p>
-      <w:pPr>
-        <w:spacing w:line="480" w:lineRule="auto" w:after="0"/>
-        <w:ind w:firstLine="720"/>
-      </w:pPr>
-      <w:r>
-        <w:rPr>
-          <w:b w:val="0"/>
-          <w:i w:val="0"/>
-        </w:rPr>
-        <w:t>K-means was evaluated across multiple values of k using inertia and silhouette scores rather than selecting k by assumption.  The cluster-profile table translates the selected groups back into original wine chemistry measures, which makes the clusters easier to interpret than PCA scores alone.</w:t>
+        <w:t>For the Wine data, the notebook checked missingness, duplicates, feature ranges, and correlation structure before modeling.  PCA retained 5 components and 80.2% of the standardized variance, reducing 13 chemistry measures while preserving most of the information (Jolliffe, 2002).  K-means was then evaluated for k = 2 through 7.  The best silhouette score occurred at k = 3, and the profile table translated those clusters back into original chemistry measures instead of leaving the result as abstract PCA scores.</w:t>
       </w:r>
     </w:p>
     <w:p>
@@ -214,7 +188,20 @@
           <w:b w:val="0"/>
           <w:i w:val="0"/>
         </w:rPr>
-        <w:t>Hierarchical clustering provided a second clustering structure and helped test whether the K-means result was a method artifact.  The assumption investigation checked missingness, scaling, distance sensitivity, PCA variance retention, and cluster stability across methods.  The results should be treated as exploratory groups, not verified classes, because unsupervised learning identifies structure rather than ground-truth labels (MacQueen, 1967; Ward, 1963).  The public repository is `https://github.com/maldo81/dds-8555-predictive-analysis`, and the notebook path is `Week 7/Assignment 7/MaldonadoJDDS8555-7.ipynb`.</w:t>
+        <w:t>Ward hierarchical clustering was used as the main method comparison, with complete linkage added as a sensitivity check.  Ward agreed with k-means on 167 of 178 wines after optimal label matching, or 93.8%, while complete linkage agreed on 131 of 178, or 73.6%.  The assumption diagnostics checked clean numeric inputs, scaling, correlated predictors motivating PCA, cluster-level silhouettes, seed stability, and linkage sensitivity.  These checks support a stable three-cluster solution for this preprocessing choice, but the result remains exploratory rather than a verified classification of cultivars (Aeberhard &amp; Forina, 1992; Ezugwu et al., 2022; Ward, 1963).</w:t>
+      </w:r>
+    </w:p>
+    <w:p>
+      <w:pPr>
+        <w:spacing w:line="480" w:lineRule="auto"/>
+        <w:jc w:val="center"/>
+      </w:pPr>
+      <w:r>
+        <w:rPr>
+          <w:b/>
+          <w:i w:val="0"/>
+        </w:rPr>
+        <w:t>GitHub Evidence</w:t>
       </w:r>
     </w:p>
     <w:p>
@@ -227,7 +214,20 @@
           <w:b w:val="0"/>
           <w:i w:val="0"/>
         </w:rPr>
-        <w:t>GitHub/code note: The Python notebook is the code artifact for this assignment and is ready to post with the submission.  The assignment prompt gives one page plus Python notebook as the length guidance, and the notebook carries the detailed output, diagnostics, and submission evidence.</w:t>
+        <w:t>The public repository is `https://github.com/maldo81/dds-8555-predictive-analysis`, and the notebook path is `Week 7/Assignment 7/MaldonadoJDDS8555-7.ipynb`.  The public assignment repository is limited to the requested deliverables for this assignment: the Word document and the executed notebook.</w:t>
+      </w:r>
+    </w:p>
+    <w:p>
+      <w:pPr>
+        <w:spacing w:line="480" w:lineRule="auto" w:after="0"/>
+        <w:ind w:firstLine="720"/>
+      </w:pPr>
+      <w:r>
+        <w:rPr>
+          <w:b w:val="0"/>
+          <w:i w:val="0"/>
+        </w:rPr>
+        <w:t>GitHub/code note: The Python notebook is the code artifact for this assignment and is posted with the public submission repository.  The assignment prompt gives one page plus Python notebook as the length guidance, and the notebook carries the detailed output, diagnostics, and submission evidence.</w:t>
       </w:r>
     </w:p>
     <w:p>
@@ -259,7 +259,16 @@
         <w:ind w:left="720" w:hanging="720"/>
       </w:pPr>
       <w:r>
-        <w:t>Cortez, P., Cerdeira, A., Almeida, F., Matos, T., &amp; Reis, J. (2009).  Modeling wine preferences by data mining from physicochemical properties.  Decision Support Systems, 47(4), 547-553. https://doi.org/10.1016/j.dss.2009.05.016</w:t>
+        <w:t>Aeberhard, S., &amp; Forina, M. (1992).  Wine [Dataset].  UCI Machine Learning Repository. https://doi.org/10.24432/C5PC7J</w:t>
+      </w:r>
+    </w:p>
+    <w:p>
+      <w:pPr>
+        <w:spacing w:line="480" w:lineRule="auto"/>
+        <w:ind w:left="720" w:hanging="720"/>
+      </w:pPr>
+      <w:r>
+        <w:t>Ezugwu, A.  E., Ikotun, A.  M., Oyelade, O.  O., Abualigah, L., Agushaka, J.  O., Eke, C.  I., &amp; Akinyelu, A.  A. (2022).  A comprehensive survey of clustering algorithms: State-of-the-art machine learning applications, taxonomy, challenges, and future research prospects.  Engineering Applications of Artificial Intelligence, 110, 104743. https://doi.org/10.1016/j.engappai.2022.104743</w:t>
       </w:r>
     </w:p>
     <w:p>

</xml_diff>